<commit_message>
Sisipkan tangkapan layar asli ke laporan praktikum
</commit_message>
<xml_diff>
--- a/docs/Laporan-Praktikum-PAW2-Aldi-Yonatan-Rusnawan.docx
+++ b/docs/Laporan-Praktikum-PAW2-Aldi-Yonatan-Rusnawan.docx
@@ -1781,98 +1781,41 @@
             <w:pPr>
               <w:jc w:val="center"/>
             </w:pPr>
-            <w:r>
-              <w:rPr>
-                <w:i/>
-                <w:iCs/>
-                <w:color w:val="6B6462"/>
-                <w:sz w:val="21"/>
-                <w:szCs w:val="21"/>
-              </w:rPr>
-              <w:t>[ Isi manual: tempel tangkapan layar di sini. Bukti teks mentah tersedia di docs/hasil-pengujian.txt ]</w:t>
-            </w:r>
-            <w:proofErr w:type="spellStart"/>
-            <w:r>
-              <w:rPr>
-                <w:i/>
-                <w:iCs/>
-                <w:color w:val="6B6462"/>
-                <w:sz w:val="21"/>
-                <w:szCs w:val="21"/>
-              </w:rPr>
-            </w:r>
-            <w:proofErr w:type="spellEnd"/>
-            <w:r>
-              <w:rPr>
-                <w:i/>
-                <w:iCs/>
-                <w:color w:val="6B6462"/>
-                <w:sz w:val="21"/>
-                <w:szCs w:val="21"/>
-              </w:rPr>
-            </w:r>
-            <w:proofErr w:type="spellStart"/>
-            <w:r>
-              <w:rPr>
-                <w:i/>
-                <w:iCs/>
-                <w:color w:val="6B6462"/>
-                <w:sz w:val="21"/>
-                <w:szCs w:val="21"/>
-              </w:rPr>
-            </w:r>
-            <w:proofErr w:type="spellEnd"/>
-            <w:r>
-              <w:rPr>
-                <w:i/>
-                <w:iCs/>
-                <w:color w:val="6B6462"/>
-                <w:sz w:val="21"/>
-                <w:szCs w:val="21"/>
-              </w:rPr>
-            </w:r>
-            <w:proofErr w:type="spellStart"/>
-            <w:r>
-              <w:rPr>
-                <w:i/>
-                <w:iCs/>
-                <w:color w:val="6B6462"/>
-                <w:sz w:val="21"/>
-                <w:szCs w:val="21"/>
-              </w:rPr>
-            </w:r>
-            <w:proofErr w:type="spellEnd"/>
-            <w:r>
-              <w:rPr>
-                <w:i/>
-                <w:iCs/>
-                <w:color w:val="6B6462"/>
-                <w:sz w:val="21"/>
-                <w:szCs w:val="21"/>
-              </w:rPr>
-            </w:r>
-            <w:proofErr w:type="spellStart"/>
-            <w:proofErr w:type="gramStart"/>
-            <w:r>
-              <w:rPr>
-                <w:i/>
-                <w:iCs/>
-                <w:color w:val="6B6462"/>
-                <w:sz w:val="21"/>
-                <w:szCs w:val="21"/>
-              </w:rPr>
-            </w:r>
-            <w:proofErr w:type="spellEnd"/>
-            <w:r>
-              <w:rPr>
-                <w:i/>
-                <w:iCs/>
-                <w:color w:val="6B6462"/>
-                <w:sz w:val="21"/>
-                <w:szCs w:val="21"/>
-              </w:rPr>
-            </w:r>
-            <w:proofErr w:type="gramEnd"/>
+            <w:r/>
+            <w:r>
+              <w:drawing>
+                <wp:inline xmlns:a="http://schemas.openxmlformats.org/drawingml/2006/main" xmlns:pic="http://schemas.openxmlformats.org/drawingml/2006/picture">
+                  <wp:extent cx="5580000" cy="686015"/>
+                  <wp:docPr id="2" name="Picture 2"/>
+                  <wp:cNvGraphicFramePr>
+                    <a:graphicFrameLocks noChangeAspect="1"/>
+                  </wp:cNvGraphicFramePr>
+                  <a:graphic>
+                    <a:graphicData uri="http://schemas.openxmlformats.org/drawingml/2006/picture">
+                      <pic:pic>
+                        <pic:nvPicPr>
+                          <pic:cNvPr id="0" name="gambar-1-terminal-node-app.png"/>
+                          <pic:cNvPicPr/>
+                        </pic:nvPicPr>
+                        <pic:blipFill>
+                          <a:blip r:embed="rId12"/>
+                          <a:stretch>
+                            <a:fillRect/>
+                          </a:stretch>
+                        </pic:blipFill>
+                        <pic:spPr>
+                          <a:xfrm>
+                            <a:off x="0" y="0"/>
+                            <a:ext cx="5580000" cy="686015"/>
+                          </a:xfrm>
+                          <a:prstGeom prst="rect"/>
+                        </pic:spPr>
+                      </pic:pic>
+                    </a:graphicData>
+                  </a:graphic>
+                </wp:inline>
+              </w:drawing>
+            </w:r>
           </w:p>
         </w:tc>
       </w:tr>
@@ -1889,7 +1832,7 @@
           <w:sz w:val="20"/>
           <w:szCs w:val="20"/>
         </w:rPr>
-        <w:t>Gambar 1. Tangkapan layar log terminal saat menjalankan npm test dan npm run dev (isi manual oleh penulis laporan).</w:t>
+        <w:t>Gambar 1. Tangkapan layar terminal PowerShell saat menjalankan perintah node app.js; terlihat pesan "Server berjalan di http://localhost:3000" sebagai tanda server aktif.</w:t>
       </w:r>
     </w:p>
     <w:tbl>
@@ -1931,98 +1874,41 @@
             <w:pPr>
               <w:jc w:val="center"/>
             </w:pPr>
-            <w:r>
-              <w:rPr>
-                <w:i/>
-                <w:iCs/>
-                <w:color w:val="6B6462"/>
-                <w:sz w:val="21"/>
-                <w:szCs w:val="21"/>
-              </w:rPr>
-              <w:t>[ Isi manual: tempel tangkapan layar di sini. Bukti teks mentah tersedia di docs/hasil-pengujian.txt ]</w:t>
-            </w:r>
-            <w:proofErr w:type="spellStart"/>
-            <w:r>
-              <w:rPr>
-                <w:i/>
-                <w:iCs/>
-                <w:color w:val="6B6462"/>
-                <w:sz w:val="21"/>
-                <w:szCs w:val="21"/>
-              </w:rPr>
-            </w:r>
-            <w:proofErr w:type="spellEnd"/>
-            <w:r>
-              <w:rPr>
-                <w:i/>
-                <w:iCs/>
-                <w:color w:val="6B6462"/>
-                <w:sz w:val="21"/>
-                <w:szCs w:val="21"/>
-              </w:rPr>
-            </w:r>
-            <w:proofErr w:type="spellStart"/>
-            <w:r>
-              <w:rPr>
-                <w:i/>
-                <w:iCs/>
-                <w:color w:val="6B6462"/>
-                <w:sz w:val="21"/>
-                <w:szCs w:val="21"/>
-              </w:rPr>
-            </w:r>
-            <w:proofErr w:type="spellEnd"/>
-            <w:r>
-              <w:rPr>
-                <w:i/>
-                <w:iCs/>
-                <w:color w:val="6B6462"/>
-                <w:sz w:val="21"/>
-                <w:szCs w:val="21"/>
-              </w:rPr>
-            </w:r>
-            <w:proofErr w:type="spellStart"/>
-            <w:r>
-              <w:rPr>
-                <w:i/>
-                <w:iCs/>
-                <w:color w:val="6B6462"/>
-                <w:sz w:val="21"/>
-                <w:szCs w:val="21"/>
-              </w:rPr>
-            </w:r>
-            <w:proofErr w:type="spellEnd"/>
-            <w:r>
-              <w:rPr>
-                <w:i/>
-                <w:iCs/>
-                <w:color w:val="6B6462"/>
-                <w:sz w:val="21"/>
-                <w:szCs w:val="21"/>
-              </w:rPr>
-            </w:r>
-            <w:proofErr w:type="spellStart"/>
-            <w:proofErr w:type="gramStart"/>
-            <w:r>
-              <w:rPr>
-                <w:i/>
-                <w:iCs/>
-                <w:color w:val="6B6462"/>
-                <w:sz w:val="21"/>
-                <w:szCs w:val="21"/>
-              </w:rPr>
-            </w:r>
-            <w:proofErr w:type="spellEnd"/>
-            <w:r>
-              <w:rPr>
-                <w:i/>
-                <w:iCs/>
-                <w:color w:val="6B6462"/>
-                <w:sz w:val="21"/>
-                <w:szCs w:val="21"/>
-              </w:rPr>
-            </w:r>
-            <w:proofErr w:type="gramEnd"/>
+            <w:r/>
+            <w:r>
+              <w:drawing>
+                <wp:inline xmlns:a="http://schemas.openxmlformats.org/drawingml/2006/main" xmlns:pic="http://schemas.openxmlformats.org/drawingml/2006/picture">
+                  <wp:extent cx="5760000" cy="645000"/>
+                  <wp:docPr id="3" name="Picture 3"/>
+                  <wp:cNvGraphicFramePr>
+                    <a:graphicFrameLocks noChangeAspect="1"/>
+                  </wp:cNvGraphicFramePr>
+                  <a:graphic>
+                    <a:graphicData uri="http://schemas.openxmlformats.org/drawingml/2006/picture">
+                      <pic:pic>
+                        <pic:nvPicPr>
+                          <pic:cNvPr id="0" name="gambar-2-vercel-mahasiswa.png"/>
+                          <pic:cNvPicPr/>
+                        </pic:nvPicPr>
+                        <pic:blipFill>
+                          <a:blip r:embed="rId13"/>
+                          <a:stretch>
+                            <a:fillRect/>
+                          </a:stretch>
+                        </pic:blipFill>
+                        <pic:spPr>
+                          <a:xfrm>
+                            <a:off x="0" y="0"/>
+                            <a:ext cx="5760000" cy="645000"/>
+                          </a:xfrm>
+                          <a:prstGeom prst="rect"/>
+                        </pic:spPr>
+                      </pic:pic>
+                    </a:graphicData>
+                  </a:graphic>
+                </wp:inline>
+              </w:drawing>
+            </w:r>
           </w:p>
         </w:tc>
       </w:tr>
@@ -2039,7 +1925,7 @@
           <w:sz w:val="20"/>
           <w:szCs w:val="20"/>
         </w:rPr>
-        <w:t>Gambar 2. Tangkapan layar respons JSON dari endpoint /mahasiswa pada aplikasi Vercel (isi manual oleh penulis laporan).</w:t>
+        <w:t>Gambar 2. Tangkapan layar respons JSON dari endpoint /mahasiswa pada aplikasi Vercel (https://si5blatihanrestfulaldiyonatanrusnaw.vercel.app/mahasiswa).</w:t>
       </w:r>
     </w:p>
     <w:p>

</xml_diff>